<commit_message>
2Samuel 2nd re-audit: restore 62 MSG omissions (EN/KO), docx rebuilt, GDocs 24/24 verified
</commit_message>
<xml_diff>
--- a/gdocs_build/2Samuel.docx
+++ b/gdocs_build/2Samuel.docx
@@ -2314,7 +2314,7 @@
               <w:rPr>
                 <w:sz w:val="18"/>
               </w:rPr>
-              <w:t>So they got ready to throw down. Twelve guys from Benjamin for Ish-Bosheth, and twelve of David's soldiers. It was wild—each guy grabbed his opponent's head and stabbed him with a sword. They all died right there, the whole group together. So they named the place 'Slaughter Park,' and it's right there in Gibeon.</w:t>
+              <w:t>So they got ready to throw down. Twelve Benjaminites for Ish-Bosheth, and twelve of David's soldiers. It was wild—each guy grabbed his opponent's head and stabbed him with a sword. They all died right there, the whole group together. So they named the place 'Slaughter Park,' and it's right there in Gibeon.</w:t>
             </w:r>
           </w:p>
         </w:tc>
@@ -2385,7 +2385,7 @@
               <w:rPr>
                 <w:sz w:val="18"/>
               </w:rPr>
-              <w:t>The battle got super intense after that. Abner and the men of Israel got totally crushed by David's crew. Joab and his two brothers, Abishai and Asahel, were there. Asahel was crazy fast, like a gazelle, and he started chasing Abner, sticking right on his tail.</w:t>
+              <w:t>The battle got super intense after that. Abner and the men of Israel got totally crushed by David's crew. The three sons of Zeruiah—Joab, Abishai, and Asahel—were there. Asahel was crazy fast, like a gazelle, and he started chasing Abner, sticking right on his tail.</w:t>
             </w:r>
           </w:p>
         </w:tc>
@@ -2408,7 +2408,7 @@
               <w:rPr>
                 <w:sz w:val="18"/>
               </w:rPr>
-              <w:t>그날 싸움은 갈수록 완전 엉망이 됐어. 아브넬이랑 이스라엘 군대는 다윗의 부하들한테 완전히 밀렸지. 그때 요압의 동생 세 명, 요압, 아비새, 아사헬이 있었는데, 아사헬이 진짜 들판의 야생 영양처럼 엄청 빨랐음. 걔가 아브넬을 끈질기게 쫓아간 거야.</w:t>
+              <w:t>그날 싸움은 갈수록 완전 엉망이 됐어. 아브넬이랑 이스라엘 군대는 다윗의 부하들한테 완전히 밀렸지. 그때 스루야의 세 아들, 요압, 아비새, 아사헬이 있었는데, 아사헬이 진짜 들판의 야생 영양처럼 엄청 빨랐음. 걔가 아브넬을 끈질기게 쫓아간 거야.</w:t>
             </w:r>
           </w:p>
         </w:tc>
@@ -2748,7 +2748,7 @@
               <w:rPr>
                 <w:sz w:val="18"/>
               </w:rPr>
-              <w:t>But he wouldn't quit, so Abner jabbed him in the stomach with the butt end of his spear. He hit him so hard it went right through his back. Asahel dropped and died right there. Everyone who came to that spot just stopped and stared at his body.</w:t>
+              <w:t>But he wouldn't quit, so Abner jabbed him in the stomach with the butt end of his spear. He hit him so hard it went right through his back. Asahel dropped and died right there. Everyone who came to that spot just stopped and stared at his body. But Joab and Abishai kept chasing after Abner. As the sun was setting, they reached the hill of Ammah, which faced Giah on the road to the backcountry of Gibeon. The Benjaminites had taken their stand with Abner there, spread out strategically on top of the hill.</w:t>
             </w:r>
           </w:p>
         </w:tc>
@@ -2771,7 +2771,7 @@
               <w:rPr>
                 <w:sz w:val="18"/>
               </w:rPr>
-              <w:t>그래도 아사헬이 포기를 안 하니까, 아브넬이 창 뒷부분으로 걔 배를 냅다 찔렀는데, 창이 등을 뚫고 나와버렸어. 아사헬은 그 자리에서 쓰러져 바로 죽었지. 그곳에 도착한 사람들은 다들 아사헬이 쓰러져 죽은 걸 보고 멈춰 서서 멍하니 쳐다봤대.</w:t>
+              <w:t>그래도 아사헬이 포기를 안 하니까, 아브넬이 창 뒷부분으로 걔 배를 냅다 찔렀는데, 창이 등을 뚫고 나와버렸어. 아사헬은 그 자리에서 쓰러져 바로 죽었지. 그곳에 도착한 사람들은 다들 아사헬이 쓰러져 죽은 걸 보고 멈춰 서서 멍하니 쳐다봤대. 근데 요압이랑 아비새는 아브넬 추격을 계속했어. 해가 지기 시작할 때쯤, 그들은 기브온 변두리로 가는 길에서 기아를 마주보는 암마 언덕에 도착했어. 베냐민 사람들은 아브넬이랑 같이 거기 언덕 위에 전략적으로 진을 치고 있었대.</w:t>
             </w:r>
           </w:p>
         </w:tc>
@@ -4007,7 +4007,7 @@
               <w:rPr>
                 <w:sz w:val="18"/>
               </w:rPr>
-              <w:t>Abner totally lost it at Ish-Bosheth. "You think I'm some kind of dog? This is the thanks I get for being loyal to your dad's family and friends? I literally saved you from being captured by David, and you're gonna get mad at me for hooking up with a woman? You know what, I'm gonna help God make his promise to David come true. I'm gonna take the kingdom from Saul's family and make David the king of everyone, Israel and Judah. If I don't, I hope God messes me up."</w:t>
+              <w:t>Abner totally lost it at Ish-Bosheth. "You think I'm some kind of dog? This is the thanks I get for being loyal to your dad's family and friends? I literally saved you from being captured by David, and you're gonna get mad at me for hooking up with a woman? You know what, I'm gonna help God make his promise to David come true. I'm gonna take the kingdom from Saul's family and make David the king of everyone, Israel and Judah, from Dan to Beersheba. If I don't, I hope God messes me up."</w:t>
             </w:r>
           </w:p>
         </w:tc>
@@ -4362,7 +4362,7 @@
               <w:rPr>
                 <w:sz w:val="18"/>
               </w:rPr>
-              <w:t>Ish-Bosheth made her leave her husband, Paltiel. But Paltiel followed her, crying the whole way, until they got to Bahurim. Then Abner told him, "Go home," and he did.</w:t>
+              <w:t>Ish-Bosheth made her leave her husband, Paltiel son of Laish. But Paltiel followed her, crying the whole way, until they got to Bahurim. Then Abner told him, "Go home," and he did.</w:t>
             </w:r>
           </w:p>
         </w:tc>
@@ -4717,7 +4717,7 @@
               <w:rPr>
                 <w:sz w:val="18"/>
               </w:rPr>
-              <w:t>Right after that, David's men, led by Joab, came back from a mission. Abner was already gone. When Joab and his crew got there, they were told that Abner had been there with David and had left on good terms.</w:t>
+              <w:t>Right after that, David's men, led by Joab, came back from a mission. Abner son of Ner was already gone--he wasn't in Hebron with David anymore.When Joab and his crew got there, they were told that Abner had been there with David and had left on good terms.</w:t>
             </w:r>
           </w:p>
         </w:tc>
@@ -4788,7 +4788,7 @@
               <w:rPr>
                 <w:sz w:val="18"/>
               </w:rPr>
-              <w:t>Joab went straight to the king and was like, "What did you just do? Abner shows up, and you just let him go? You know what he's like. He wasn't here to be friends. He was here to spy on you and figure out what you're up to."</w:t>
+              <w:t>Joab went straight to the king and was like, "What did you just do? Abner shows up, and you just let him go? You know Abner son of Ner—he wasn't here to be friends. He was here to spy on you and figure out what you're up to."</w:t>
             </w:r>
           </w:p>
         </w:tc>
@@ -4811,7 +4811,7 @@
               <w:rPr>
                 <w:sz w:val="18"/>
               </w:rPr>
-              <w:t>요압은 바로 왕한테 달려가서 따졌대. "아니, 지금 뭐 하신 거예요? 아브넬이 왔는데 그냥 보내주다니요? 걔가 어떤 놈인지 아시잖아요. 그냥 친구로 온 거 아니라고요. 정탐하러 온 거임. 왕이 어디 가고 뭘 하는지 다 알아내려고 온 거라고요."</w:t>
+              <w:t>요압은 바로 왕한테 달려가서 따졌대. "아니, 지금 뭐 하신 거예요? 아브넬이 왔는데 그냥 보내주다니요? 아브넬 넬의 아들이 어떤 놈인지 아시잖아요. 그냥 친구로 온 게 아니라고요. 정탐하러 온 거임. 왕이 어디 가고 뭘 하는지 다 알아내려고 온 거라고요."</w:t>
             </w:r>
           </w:p>
         </w:tc>
@@ -4859,7 +4859,7 @@
               <w:rPr>
                 <w:sz w:val="18"/>
               </w:rPr>
-              <w:t>Joab left David and immediately sent messengers after Abner. They caught up with him at a well and brought him back. David had no idea. When Abner got back to Hebron, Joab pulled him aside at the gate to talk privately. And then he stabbed him in the stomach and killed him, to get revenge for his brother Asahel's death.</w:t>
+              <w:t>Joab left David and immediately sent messengers after Abner. They caught up with him at the well at Sirah and brought him back. David had no idea. When Abner got back to Hebron, Joab pulled him aside at the gate to talk privately. And then he stabbed him in the stomach and killed him, to get revenge for his brother Asahel's death.</w:t>
             </w:r>
           </w:p>
         </w:tc>
@@ -4930,7 +4930,7 @@
               <w:rPr>
                 <w:sz w:val="18"/>
               </w:rPr>
-              <w:t>When David heard what happened, he said, "God knows that my kingdom and I are innocent of Abner's murder. Joab and his whole family will be cursed for this. I hope they're always dealing with sickness, violence, and hunger." (Joab and his brother Abishai killed Abner because he had killed their brother Asahel in a battle.)</w:t>
+              <w:t>When David heard what happened, he said, "God knows that my kingdom and I are innocent of the murder of Abner son of Ner. Joab and his whole family will be cursed for this. I hope they're always dealing with sickness, violence, and hunger." (Joab and his brother Abishai killed Abner because he had killed their brother Asahel at the battle of Gibeon.)</w:t>
             </w:r>
           </w:p>
         </w:tc>
@@ -4953,7 +4953,7 @@
               <w:rPr>
                 <w:sz w:val="18"/>
               </w:rPr>
-              <w:t>나중에 다윗은 이 소식을 듣고 말했어. "하나님 앞에서 나와 내 나라는 넬의 아들 아브넬의 죽음에 대해 완전히 결백하다. 이 피의 대가는 요압과 그의 온 집안이 저주로 받게 될 것이다. 그들은 영원히 끔찍한 질병과 폭력, 굶주림의 희생자가 되기를." (요압과 그의 동생 아비새가 아브넬을 죽인 이유는, 그가 기브온 전투에서 자기들 동생 아사헬을 죽였기 때문이래.)</w:t>
+              <w:t>나중에 다윗은 이 소식을 듣고 말했어. "하나님 앞에서 나와 내 나라는 넬의 아들 아브넬의 살해에 대해 완전히 결백하다. 이 피의 대가는 요압과 그의 온 집안이 저주로 받게 될 것이다. 그들은 영원히 끔찍한 질병과 폭력, 굶주림의 희생자가 되기를." (요압과 그의 동생 아비새가 아브넬을 죽인 이유는, 그가 기브온 전투에서 자기들 동생 아사헬을 죽였기 때문이래.)</w:t>
             </w:r>
           </w:p>
         </w:tc>
@@ -5301,7 +5301,7 @@
               <w:rPr>
                 <w:sz w:val="18"/>
               </w:rPr>
-              <w:t>Then they all tried to get David to eat something before it got dark. But David swore, "I swear to God, I won't eat anything, not even a piece of bread, before the sun sets." Everyone there saw it and was impressed. Actually, everything the king did, the people loved. It was obvious to everyone that day that the king had nothing to do with Abner's death.</w:t>
+              <w:t>Then they all tried to get David to eat something before it got dark. But David swore, "I swear to God, I won't eat anything, not even a piece of bread, before the sun sets." Everyone there saw it and was impressed. Actually, everything the king did, the people loved. It was obvious to everyone that day, including all of Israel, that the king had nothing to do with the murder of Abner son of Ner.</w:t>
             </w:r>
           </w:p>
         </w:tc>
@@ -5324,7 +5324,7 @@
               <w:rPr>
                 <w:sz w:val="18"/>
               </w:rPr>
-              <w:t>그러고 나서 모두가 다윗에게 와서 해가 지기 전에 뭐라도 좀 먹으라고 권했어. 하지만 다윗은 단호하게 맹세했대. "하나님, 맹세컨대 해가 지기 전까지 빵 한 조각이나 그 어떤 것도 입에 대지 않겠습니다!" 장례식에 있던 모든 사람들이 그걸 보고 감동했대. 사실 왕이 하는 모든 행동에 백성들은 박수를 보냈어. 그날 모든 이스라엘 백성을 포함한 모든 사람들은 왕이 아브넬의 죽음과 아무 관련이 없다는 걸 분명히 알게 됐대.</w:t>
+              <w:t>그러고 나서 모두가 다윗에게 와서 해가 지기 전에 뭐라도 좀 먹으라고 권했어. 하지만 다윗은 단호하게 맹세했대. "하나님, 맹세컨대 해가 지기 전까지 빵 한 조각이나 그 어떤 것도 입에 대지 않겠습니다!" 장례식에 있던 모든 사람들이 그걸 보고 감동했대. 사실 왕이 하는 모든 행동에 백성들은 박수를 보냈어. 그날 모든 이스라엘 백성을 포함한 모든 사람들은 왕이 넬의 아들 아브넬의 살해와 아무 관련이 없다는 걸 분명히 알게 됐대.</w:t>
             </w:r>
           </w:p>
         </w:tc>
@@ -5510,7 +5510,7 @@
               <w:rPr>
                 <w:sz w:val="18"/>
               </w:rPr>
-              <w:t>When Saul's son, Ish-Bosheth, heard that Abner was dead, he was devastated. His courage just evaporated, and the whole country was shook.</w:t>
+              <w:t>When Saul's son, Ish-Bosheth, heard that Abner had died in Hebron, he was devastated. His courage just evaporated, and the whole country was shook.</w:t>
             </w:r>
           </w:p>
         </w:tc>
@@ -5723,7 +5723,7 @@
               <w:rPr>
                 <w:sz w:val="18"/>
               </w:rPr>
-              <w:t>So one day, Baanah and Recab, the sons of Rimmon, headed over to Ish-Bosheth's house. They got there during the hottest part of the day, right when he was taking his afternoon nap. They got in by pretending they were there on official business. The guard at his bedroom door had dozed off, so they slipped right past her and went into the room where Ish-Bosheth was sleeping. They killed him, cut off his head, and took it as a trophy. They traveled all night through the Arabah Valley.</w:t>
+              <w:t>So one day, Baanah and Recab, the two sons of Rimmon, headed over to Ish-Bosheth's house. They got there during the hottest part of the day, right when he was taking his afternoon nap. They got in by pretending they were there on official business. The guard at his bedroom door had dozed off, so they slipped right past her and went into the room where Ish-Bosheth was sleeping. They killed him, cut off his head, and took it as a trophy. They traveled all night through the Arabah Valley.</w:t>
             </w:r>
           </w:p>
         </w:tc>
@@ -5865,7 +5865,7 @@
               <w:rPr>
                 <w:sz w:val="18"/>
               </w:rPr>
-              <w:t>David looked at the brothers, Recab and Baanah, and said, "As surely as God lives—the God who has saved me from all my troubles—when a guy brought me the news that Saul was dead, thinking I'd be thrilled, I had him arrested and killed right there in Ziklag. That was his reward for the 'good news.' And now you two, a couple of evil men, have murdered an innocent man in his own bed. You really think I won't hold you accountable for this murder and get rid of you?"</w:t>
+              <w:t>David looked at the brothers, Recab and Baanah, sons of Rimmon the Beerothite, and said, "As surely as God lives—the God who has saved me from all my troubles—when a guy brought me the news that Saul was dead, thinking I'd be thrilled, I had him arrested and killed right there in Ziklag. That was his reward for the 'good news.' And now you two, a couple of evil men, have murdered an innocent man in his own bed. You really think I won't hold you accountable for this murder and get rid of you?"</w:t>
             </w:r>
           </w:p>
         </w:tc>
@@ -7515,7 +7515,7 @@
               <w:rPr>
                 <w:sz w:val="18"/>
               </w:rPr>
-              <w:t>David was actually pretty ticked off that God had lashed out at Uzzah like that. They even named that place Perez Uzzah, which means 'The-Explosion-Against-Uzzah.' After that, David was genuinely afraid of God and was like, 'This Ark is way too intense. How am I ever gonna get it back to the City of David?' So he decided not to move the Ark any farther. Instead, he took it to the house of a guy named Obed-Edom. The Ark of God stayed with Obed-Edom's family for three months, and God totally blessed him and his entire household.</w:t>
+              <w:t>David was actually pretty ticked off that God had lashed out at Uzzah like that. They even named that place Perez Uzzah, which means 'The-Explosion-Against-Uzzah.' After that, David was genuinely afraid of God and was like, 'This Ark is way too intense. How am I ever gonna get it back to the City of David?' So he decided not to move the Ark any farther. Instead, he took it to the house of Obed-Edom the Gittite. The Ark of God stayed at the house of Obed-Edom the Gittite for three months, and God totally blessed him and his entire household.</w:t>
             </w:r>
           </w:p>
         </w:tc>
@@ -8785,7 +8785,7 @@
               <w:rPr>
                 <w:sz w:val="18"/>
               </w:rPr>
-              <w:t>Then he took on Moab. Get this—he made them lie down on the ground, and then randomly executed two-thirds of them. Super harsh. The survivors had to serve David and pay him taxes.</w:t>
+              <w:t>Then he took on Moab. Get this—he made them lie down on the ground, and then randomly executed two-thirds of them. SSuper harsh. He spared the other third,but they had to serve David and pay him taxes.</w:t>
             </w:r>
           </w:p>
         </w:tc>
@@ -8856,7 +8856,7 @@
               <w:rPr>
                 <w:sz w:val="18"/>
               </w:rPr>
-              <w:t>Next up, David was on his way to get his power back at the Euphrates River when he ran into Hadadezer, the king of Zobah. David's army crushed him, capturing 1,000 chariots, 7,000 horsemen, and 20,000 soldiers. He lamed most of the chariot horses but kept 100 for himself.</w:t>
+              <w:t>Next up, David was on his way to get his power back at the Euphrates River when he ran into Hadadezer son of Rehob, the king of Zobah. David's army crushed him, capturing 1,000 chariots, 7,000 horsemen, and 20,000 soldiers. He lamed most of the chariot horses but kept 100 for himself.</w:t>
             </w:r>
           </w:p>
         </w:tc>
@@ -8927,7 +8927,7 @@
               <w:rPr>
                 <w:sz w:val="18"/>
               </w:rPr>
-              <w:t>Then the Arameans from Damascus tried to help out Hadadezer, but that was a bad move. David's crew took down 22,000 of them. David basically set up his own guys to rule in Damascus, and the Arameans had to pay up too. God kept giving David victory everywhere he went.</w:t>
+              <w:t>Then the Arameans from Damascus tried to help out Hadadezer, king of Zobah, but that was a bad move. David's crew took down 22,000 of them. David basically set up his own guys to rule in Damascus, and the Arameans had to pay up too. God kept giving David victory everywhere he went.</w:t>
             </w:r>
           </w:p>
         </w:tc>
@@ -8950,7 +8950,7 @@
               <w:rPr>
                 <w:sz w:val="18"/>
               </w:rPr>
-              <w:t>다마스쿠스의 아람 사람들이 하닷에셀을 도우러 왔다가 다윗한테 22,000명이나 죽었대. 다윗이 다마스쿠스에 자기 부하들을 세워서 다스리게 했고, 아람 사람들도 다윗의 신하가 돼서 조공을 바쳐야 했어. 진짜 하나님이 다윗이 어딜 가든 이기게 해주신 거임.</w:t>
+              <w:t>다마스쿠스의 아람 사람들이 소바 왕 하닷에셀을 도우러 왔다가 다윗한테 22,000명이나 죽었대. 다윗이 다마스쿠스에 자기 부하들을 세워서 다스리게 했고, 아람 사람들도 다윗의 신하가 돼서 조공을 바쳐야 했어. 진짜 하나님이 다윗이 어딜 가든 이기게 해주신 거임.</w:t>
             </w:r>
           </w:p>
         </w:tc>
@@ -9069,7 +9069,7 @@
               <w:rPr>
                 <w:sz w:val="18"/>
               </w:rPr>
-              <w:t>When Toi, the king of Hamath, heard that David had completely owned Hadadezer's army, he sent his son Joram to congratulate David. Toi and Hadadezer were enemies, so he was pretty stoked. Joram brought gifts of silver, gold, and bronze. King David dedicated all this stuff to God, along with the silver and gold he'd taken from all the other nations he conquered—Aram, Moab, the Ammonites, the Philistines, Amalek, and all the loot from Hadadezer.</w:t>
+              <w:t>When Toi, the king of Hamath, heard that David had completely owned Hadadezer's army, he sent his son Joram to congratulate David. Toi and Hadadezer were enemies, so he was pretty stoked. Joram brought gifts of silver, gold, and bronze. King David dedicated all this stuff to God, along with the silver and gold he'd taken from all the other nations he conquered—Aram, Moab, the Ammonites, the Philistines, Amalek, aand all the loot from Hadadezer son of Rehob, king of Zobah.</w:t>
             </w:r>
           </w:p>
         </w:tc>
@@ -10549,7 +10549,7 @@
               <w:rPr>
                 <w:sz w:val="18"/>
               </w:rPr>
-              <w:t>King David didn’t waste any time. He immediately sent his guys to go get him from Makir’s house in Lo Debar.</w:t>
+              <w:t>King David didn’t waste any time. He immediately sent his guys to go get him from the house of Makir son of Ammiel in Lo Debar.</w:t>
             </w:r>
           </w:p>
         </w:tc>
@@ -13374,7 +13374,7 @@
               <w:rPr>
                 <w:sz w:val="18"/>
               </w:rPr>
-              <w:t>Then David told the messenger, 'Oh, I see. Tell Joab, 'Don't sweat it. People die in war—you never know who's next. Just attack the city even harder and destroy it.' Go encourage Joab.'</w:t>
+              <w:t>When the messenger finished his report, David was actually furious at Joab, and he vented it on the messenger: 'Why did you get so close to the city? Didn't you know they'd attack you from the wall? Don't you remember how Abimelech son of Jerub-Besheth died? A woman dropped a millstone on him from the wall and crushed him at Thebez! Why did you go so close to the wall?!' "By the way," the messenger added, "your servant Uriah the Hittite is dead." Then David told the messenger, 'Oh, I see. Tell Joab, 'Don't sweat it. People die in war—you never know who's next. Just attack the city even harder and destroy it.' Go encourage Joab.'</w:t>
             </w:r>
           </w:p>
         </w:tc>
@@ -13397,7 +13397,7 @@
               <w:rPr>
                 <w:sz w:val="18"/>
               </w:rPr>
-              <w:t>그제야 다윗이 전령에게 말했대. '아, 그렇군. 요압에게 전해라. '이 일로 너무 신경 쓰지 말라고. 전쟁에선 누가 죽을지 모르는 법이니까. 그냥 성을 더 맹렬히 공격해서 파괴해버려라.' 가서 요압을 격려해줘라.'</w:t>
+              <w:t>전령이 보고를 마치자 다윗이 사실 요압한테 완전 화가 나서, 그 화를 전령한테 풀었대. '왜 성에 그렇게 가까이 간 거야? 성벽에서 공격할 거란 걸 몰랐어? 여룹베셋의 아들 아비멜렉이 어떻게 죽었는지 기억 안 나? 여자가 성벽에서 맷돌을 떨어뜨려서 데벳에서 깔려 죽었잖아! 왜 성벽에 그렇게 가까이 간 거야?!' "그나저나," 전령이 덧붙였대, "왕의 신하 헷 사람 우리야가 죽었습니다." 그제야 다윗이 전령에게 말했대. '아, 그렇군. 요압에게 전해라. '이 일로 너무 신경 쓰지 말라고. 전쟁에선 누가 죽을지 모르는 법이니까. 그냥 성을 더 맹렬히 공격해서 파괴해버려라.' 가서 요압을 격려해줘라.'</w:t>
             </w:r>
           </w:p>
         </w:tc>
@@ -13796,7 +13796,7 @@
               <w:rPr>
                 <w:sz w:val="18"/>
               </w:rPr>
-              <w:t>Nathan just said, “You’re the man.” And then he dropped this message from God: “I’m the one who made you king. I saved you from Saul. I gave you his family, his wives, the whole kingdom. If that wasn’t enough, I would’ve given you more. So why did you disrespect me and do this evil thing? You murdered Uriah the Hittite with the enemy’s sword and then took his wife. Because you did that, your family will never be free from violence. I’m going to bring disaster on you from your own family. I’ll take your wives right in front of you and give them to your neighbor, and he’ll be with them in broad daylight. You did your thing in secret, but I’m going to do this in front of everyone.”</w:t>
+              <w:t>Nathan just said, “You’re the man.” And then he dropped this message from God: “I’m the one who made you king. I saved you from Saul. I gave you his family, his wives, the whole kingdom. If that wasn’t enough, I would’ve given you more. So why did you disrespect me and do this evil thing? You murdered Uriah the Hittite with an Ammonite sword and then took his wife. Because you did that, your family will never be free from violence. I’m going to bring disaster on you from your own family. I’ll take your wives right in front of you and give them to your neighbor, and he’ll be with them in broad daylight. You did your thing in secret, but I’m going to do this in front of everyone.”</w:t>
             </w:r>
           </w:p>
         </w:tc>
@@ -14818,7 +14818,7 @@
               <w:rPr>
                 <w:sz w:val="18"/>
               </w:rPr>
-              <w:t>So, a while later, this terrible thing happened. King David's son, Absalom, had this super pretty sister named Tamar. And get this, their half-brother, Amnon, was totally obsessed with her. Like, he was making himself sick over it. Tamar was a virgin, and Amnon was stressing because he had no idea how to get with her. He had this one friend, Jonadab, who was his cousin and super street-smart. Jonadab was like, 'Bro, you're the king's son. Why are you so down bad every single day? Just tell me what's up.'</w:t>
+              <w:t>So, a while later, this terrible thing happened. King David's son, Absalom, had this super pretty sister named Tamar. And get this, their half-brother, Amnon, was totally obsessed with her. Like, he was making himself sick over it. Tamar was a virgin, and Amnon was stressing because he had no idea how to get with her. He had this one friend, Jonadab—the son of David's brother Shimeah—who was super street-smart. Jonadab was like, 'Bro, you're the king's son. Why are you so down bad every single day? Just tell me what's up.' "In a word, Tamar," Amnon said. "My brother Absalom's sister. I'm in love with her."</w:t>
             </w:r>
           </w:p>
         </w:tc>
@@ -14841,7 +14841,7 @@
               <w:rPr>
                 <w:sz w:val="18"/>
               </w:rPr>
-              <w:t>시간이 좀 지나서 이런 일이 있었대. 다윗의 아들 압살롬한테 엄청 예쁜 여동생이 있었는데, 이름은 다말이었어. 근데 다윗의 또 다른 아들인 암논이 이 다말을 좋아하게 된 거야. 거의 뭐 상사병에 걸릴 정도로 다말한테 집착했대. 다말은 아직 처녀였고, 암논은 어찌할 도리가 없어서 완전 막막해했지. 암논한테 요나답이라는 절친이 있었는데, 이 친구가 다윗의 형 시므아의 아들이었대. 요나답이 완전 세상 물정 밝은 애였던 거임. 걔가 암논한테 말했어. "야, 너 왕자라는 애가 왜 맨날 그렇게 시무룩해서 다니냐? 뭐가 문젠지 말 좀 해봐."</w:t>
+              <w:t>시간이 좀 지나서 이런 일이 있었대. 다윗의 아들 압살롬한테 엄청 예쁜 여동생이 있었는데, 이름은 다말이었어. 근데 다윗의 또 다른 아들인 암논이 이 다말을 좋아하게 된 거야. 거의 뭐 상사병에 걸릴 정도로 다말한테 집착했대. 다말은 아직 처녀였고, 암논은 어찌할 도리가 없어서 완전 막막해했지. 암논한테 요나답이라는 절친이 있었는데, 이 친구가 다윗의 형 시므아의 아들이었대. 요나답이 완전 세상 물정 밝은 애였던 거임. 걔가 암논한테 말했어. "야, 너 왕자라는 애가 왜 맨날 그렇게 시무룩해서 다니냐? 뭐가 문젠지 말 좀 해봐." 그러자 암논이 말했대. "한마디로 말해서, 다말이야. 내 동생 압살롬의 누나. 걔랑 사랑에 빠졌어."</w:t>
             </w:r>
           </w:p>
         </w:tc>
@@ -15457,7 +15457,7 @@
               <w:rPr>
                 <w:sz w:val="18"/>
               </w:rPr>
-              <w:t>And then, as soon as he was done, he hated her. Like, an insane amount of hatred. The hate he felt for her was even stronger than the love he'd had before. 'Get up,' he said, 'and get out!'</w:t>
+              <w:t>As soon as Amnon had raped her, he hated her. Like, an insane amount of hatred. The hate he felt for her was even stronger than the love he'd had before. 'Get up,' he said, 'and get out!'</w:t>
             </w:r>
           </w:p>
         </w:tc>
@@ -15480,7 +15480,7 @@
               <w:rPr>
                 <w:sz w:val="18"/>
               </w:rPr>
-              <w:t>근데 진짜 소름 돋는 건, 암논이 일을 끝내자마자 다말을 엄청나게 미워하기 시작했다는 거야. 그 미움이 예전에 그녀를 사랑했던 마음보다 훨씬 더 컸대. 암논이 말했어. "일어나서 당장 물러가!"</w:t>
+              <w:t>근데 진짜 소름 돋는 건, 암논이 다말을 강간하자마자 걔를 엄청나게 미워하기 시작했다는 거야. 그 미움이 예전에 그녀를 사랑했던 마음보다 훨씬 더 컸대. 암논이 말했어. "일어나서 당장 물러가!"</w:t>
             </w:r>
           </w:p>
         </w:tc>
@@ -15891,7 +15891,7 @@
               <w:rPr>
                 <w:sz w:val="18"/>
               </w:rPr>
-              <w:t>Two years passed. One day, Absalom was having a big sheep-shearing party and invited all the king's sons. He also went to the king to invite him. 'Hey, I'm having a party. You should come, and bring your crew.'</w:t>
+              <w:t>Two years passed. One day, Absalom was throwing a sheep-shearing party in Baal Hazor near Ephraim and invited all the king's sons. He also went to the king to invite him. 'Hey, I'm having a party. You should come, and bring your crew.'</w:t>
             </w:r>
           </w:p>
         </w:tc>
@@ -16325,7 +16325,7 @@
               <w:rPr>
                 <w:sz w:val="18"/>
               </w:rPr>
-              <w:t>But then Jonadab, David's nephew, showed up and said, 'My king, don't believe that all your sons are dead. Only Amnon is dead. This was Absalom's revenge plan ever since Amnon violated his sister Tamar. So don't make it worse by thinking all your sons are gone. It's just Amnon.'</w:t>
+              <w:t>But then Jonadab, the son of David's brother Shimeah, showed up and said, 'My king, don't believe that all your sons are dead. Only Amnon is dead. This was Absalom's revenge plan ever since Amnon violated his sister Tamar. So don't make it worse by thinking all your sons are gone. It's just Amnon.'</w:t>
             </w:r>
           </w:p>
         </w:tc>
@@ -16404,7 +16404,7 @@
               <w:rPr>
                 <w:sz w:val="18"/>
               </w:rPr>
-              <w:t>Absalom had already escaped.</w:t>
+              <w:t>Absalom fled. Just then the sentry on duty looked up and saw a cloud of dust on the Horonaim road, alongside the mountain. He went and told the king, 'I just saw a bunch of men on the Horonaim road, coming around the mountain.'</w:t>
             </w:r>
           </w:p>
         </w:tc>
@@ -16427,7 +16427,7 @@
               <w:rPr>
                 <w:sz w:val="18"/>
               </w:rPr>
-              <w:t>압살롬은 이미 도망친 후였어.</w:t>
+              <w:t>압살롬은 도망쳤어. 그때 당직 보초가 올려다보니까 산 옆 호로나임 길에 먼지 구름이 보이더래. 보초가 왕한테 가서 말했어. '호로나임 길에서 산을 돌아오는 남자들 무리가 보여요.'</w:t>
             </w:r>
           </w:p>
         </w:tc>
@@ -16617,7 +16617,7 @@
               <w:rPr>
                 <w:sz w:val="18"/>
               </w:rPr>
-              <w:t>After Absalom ran away, he went to stay with the king of Geshur for three years. Eventually, the king stopped trying to get revenge on Absalom. He had finally accepted that Amnon was dead.</w:t>
+              <w:t>After Absalom ran away, he went to stay with Talmai son of Ammihud, the king of Geshur. He was there for three years. Eventually, the king stopped trying to get revenge on Absalom. He had finally accepted that Amnon was dead.</w:t>
             </w:r>
           </w:p>
         </w:tc>
@@ -18929,7 +18929,7 @@
               <w:rPr>
                 <w:sz w:val="18"/>
               </w:rPr>
-              <w:t>But then, Absalom sent secret agents to all the tribes of Israel with a message: 'When you hear the sound of the ram's horn, that's the signal. You need to shout, 'Absalom is the king in Hebron!'' About two hundred men went with Absalom from Jerusalem, but they were completely clueless. They were just invited to a thing and had no idea they were part of a plot. While Absalom was offering sacrifices, he also got Ahithophel, who was one of David's own advisors, to join him. He called him from his hometown, Giloh. The conspiracy got super strong, and more and more people started supporting Absalom.</w:t>
+              <w:t>But then, Absalom sent secret agents to all the tribes of Israel with a message: 'When you hear the sound of the ram's horn, that's the signal. You need to shout, 'Absalom is the king in Hebron!'' About two hundred men went with Absalom from Jerusalem, but they were completely clueless. They were just invited to a thing and had no idea they were part of a plot. While Absalom was offering sacrifices, he also got Ahithophel the Gilonite, one of David's own advisors, to join him. He called him from his hometown, Giloh. The conspiracy got super strong, and more and more people started supporting Absalom.</w:t>
             </w:r>
           </w:p>
         </w:tc>
@@ -19426,7 +19426,7 @@
               <w:rPr>
                 <w:sz w:val="18"/>
               </w:rPr>
-              <w:t>'Alright then,' David said, 'let's go.' And so they continued on, Ittai with all his men and their families.</w:t>
+              <w:t>'Alright then,' David said, 'let's go.' And so they continued on, Ittai the Gittite with all his men and their families.</w:t>
             </w:r>
           </w:p>
         </w:tc>
@@ -19449,7 +19449,7 @@
               <w:rPr>
                 <w:sz w:val="18"/>
               </w:rPr>
-              <w:t>“좋다,” 다윗이 말했어. “그럼 가자.” 그래서 그들은 계속 갔어. 잇대와 그의 모든 부하들, 그리고 그와 함께 있던 모든 아이들까지도.</w:t>
+              <w:t>“좋다,” 다윗이 말했어. “그럼 가자.” 그래서 그들은 계속 갔어. 깃디 사람 잇대와 그의 모든 부하들, 그리고 그와 함께 있던 모든 아이들까지도.</w:t>
             </w:r>
           </w:p>
         </w:tc>
@@ -19497,7 +19497,7 @@
               <w:rPr>
                 <w:sz w:val="18"/>
               </w:rPr>
-              <w:t>The whole country was crying loudly as everyone passed by. The king crossed the Kidron Brook, and the army headed toward the wilderness. Zadok the priest was there too, with the Levites, carrying the Ark of the Covenant. They set the Ark down, and Abiathar stood by it until everyone had left the city.</w:t>
+              <w:t>The whole country was crying loudly as everyone passed by. The king crossed the Kidron Brook, and the army headed toward the wilderness. Zadok the priest was there too, with the Levites, carrying the Ark of the Covenant of God. They set the Ark of God down, and Abiathar stood by it until everyone had left the city.</w:t>
             </w:r>
           </w:p>
         </w:tc>
@@ -20653,7 +20653,7 @@
               <w:rPr>
                 <w:sz w:val="18"/>
               </w:rPr>
-              <w:t>But the king said, "Why are you guys always jumping in and making things complicated? If he's cursing me, it's because God told him to, like, 'Curse David.' So who are you to question it?"</w:t>
+              <w:t>But the king said, "Why are you sons of Zeruiah always jumping in and making things complicated? If he's cursing me, it's because God told him to, like, 'Curse David.' So who are you to question it?"</w:t>
             </w:r>
           </w:p>
         </w:tc>
@@ -20724,7 +20724,7 @@
               <w:rPr>
                 <w:sz w:val="18"/>
               </w:rPr>
-              <w:t>David went on, talking to Abishai and his other servants, "Look, my own son, my actual flesh and blood, is trying to kill me right now. Compared to that, this guy is small potatoes. Just leave him alone; let him curse. It's like he's preaching God's word to me. And who knows, maybe God will see the mess I'm in today and flip these curses into something good."</w:t>
+              <w:t>David went on, talking to Abishai and his other servants, "Look, my own son, my actual flesh and blood, is trying to kill me right now. Compared to that, this Benjaminite is small potatoes. Just leave him alone; let him curse. It's like he's preaching God's word to me. And who knows, maybe God will see the mess I'm in today and flip these curses into something good."</w:t>
             </w:r>
           </w:p>
         </w:tc>
@@ -20747,7 +20747,7 @@
               <w:rPr>
                 <w:sz w:val="18"/>
               </w:rPr>
-              <w:t>다윗이 아비새랑 다른 부하들한테 계속 말했음. "야, 내 친아들, 내 피와 살도 지금 나를 죽이려고 하는데, 쟤는 진짜 아무것도 아니지. 걍 냅둬. 저주하게 둬. 나한테 하나님의 말씀을 전하고 있는 걸 수도 있어. 또 모르지, 하나님이 오늘 내가 겪는 이 고생을 보시고 저 저주를 좋은 걸로 바꿔주실지."</w:t>
+              <w:t>다윗이 아비새랑 다른 부하들한테 계속 말했음. "야, 내 친아들, 내 피와 살도 지금 나를 죽이려고 하는데, 저 베냐민 사람은 진짜 아무것도 아니지. 걍 냅둬. 저주하게 둬. 나한테 하나님의 말씀을 전하고 있는 걸 수도 있어. 또 모르지, 하나님이 오늘 내가 겪는 이 고생을 보시고 저 저주를 좋은 걸로 바꿔주실지."</w:t>
             </w:r>
           </w:p>
         </w:tc>
@@ -22006,7 +22006,7 @@
               <w:rPr>
                 <w:sz w:val="18"/>
               </w:rPr>
-              <w:t>Absalom and all his guys agreed that Hushai's plan was way better than Ahithophel's. (It was actually God's plan to wreck Ahithophel's good advice to bring Absalom down.)</w:t>
+              <w:t>Absalom and all his guys agreed that Hushai the Arkite's plan was way better than Ahithophel's. (It was actually God's plan to wreck Ahithophel's good advice to bring Absalom down.)</w:t>
             </w:r>
           </w:p>
         </w:tc>
@@ -22029,7 +22029,7 @@
               <w:rPr>
                 <w:sz w:val="18"/>
               </w:rPr>
-              <w:t>압살롬이랑 그 부하들은 후새의 조언이 아히도벨의 조언보다 훨씬 낫다고 동의했대. (사실 이건 하나님이 아히도벨의 좋은 조언을 망쳐서 압살롬을 망하게 하려고 계획하신 거였음.)</w:t>
+              <w:t>압살롬이랑 그 부하들은 아렉 사람 후새의 조언이 아히도벨의 조언보다 훨씬 낫다고 동의했대. (사실 이건 하나님이 아히도벨의 좋은 조언을 망쳐서 압살롬을 망하게 하려고 계획하신 거였음.)</w:t>
             </w:r>
           </w:p>
         </w:tc>
@@ -22661,7 +22661,7 @@
               <w:rPr>
                 <w:sz w:val="18"/>
               </w:rPr>
-              <w:t>When David arrived at Mahanaim, Shobi son of Nahash from Rabbah, Makir son of Ammiel from Lo Debar, and Barzillai the Gileadite from Rogelim brought a bunch of stuff: beds, blankets, bowls, and jugs full of wheat, barley, flour, roasted grain, beans, and lentils, plus honey, curds, and cheese. They gave all this to David and his army to eat, because they said, "The army must be starving, exhausted, and thirsty out here in the wilderness."</w:t>
+              <w:t>When David arrived at Mahanaim, Shobi son of Nahash from Ammonite Rabbah, Makir son of Ammiel from Lo Debar, and Barzillai the Gileadite from Rogelim brought a bunch of stuff: beds, blankets, bowls, and jugs full of wheat, barley, flour, roasted grain, beans, and lentils, plus honey, curds, and cheese. They gave all this to David and his army to eat, because they said, "The army must be starving, exhausted, and thirsty out here in the wilderness."</w:t>
             </w:r>
           </w:p>
         </w:tc>
@@ -22807,7 +22807,7 @@
               <w:rPr>
                 <w:sz w:val="18"/>
               </w:rPr>
-              <w:t>So David got his squad ready. He set up captains for groups of a thousand and a hundred. Then he sent them out: one-third of the army was with Joab, one-third with Joab’s brother Abishai, and the last third with Ittai from Gath.</w:t>
+              <w:t>So David got his squad ready. He set up captains for groups of a thousand and a hundred. Then he sent them out: one-third of the army was with Joab, one-third with Abishai son of Zeruiah, Joab's brother, and the last third with Ittai the Gittite.</w:t>
             </w:r>
           </w:p>
         </w:tc>
@@ -23091,7 +23091,7 @@
               <w:rPr>
                 <w:sz w:val="18"/>
               </w:rPr>
-              <w:t>Then the king gave orders to Joab, Abishai, and Ittai: “Hey, for my sake, be gentle with the young man Absalom.” The whole army heard the king’s command about Absalom.</w:t>
+              <w:t>Then the king gave orders to Joab, Abishai, and Ittai: “Hey, for my sake, be gentle with the young man Absalom.” The whole army heard what the king commanded the three captains about Absalom.</w:t>
             </w:r>
           </w:p>
         </w:tc>
@@ -23446,7 +23446,7 @@
               <w:rPr>
                 <w:sz w:val="18"/>
               </w:rPr>
-              <w:t>The soldier replied, “Bro, even for a thousand pieces of silver, I wouldn’t touch the king’s son. We all heard the king tell you, Abishai, and Ittai, ‘Protect the young man Absalom for me.’ I’d be risking my life, ‘cause the king finds out everything. And you? You would’ve just stood there and let me take the fall!”</w:t>
+              <w:t>The soldier replied to Joab, "Bro, even for a thousand pieces of silver, I wouldn’t touch the king’s son. We all heard the king tell you, Abishai, and Ittai, ‘Protect the young man Absalom for me.’ I’d be risking my life, ‘cause the king finds out everything. And you? You would’ve just stood there and let me take the fall!”</w:t>
             </w:r>
           </w:p>
         </w:tc>
@@ -25581,7 +25581,7 @@
               <w:rPr>
                 <w:sz w:val="18"/>
               </w:rPr>
-              <w:t>But Joab went to the king privately and was like, “Seriously? You just embarrassed all your loyal soldiers who literally just saved your life, not to mention your whole family. What’s up with this? You’re loving the people who hate you and hating the people who love you? You’re basically telling everyone that your team means nothing to you. You know, if Absalom was alive right now, we’d all be dead—is that what you wanted? Get it together, man. Go out there and encourage your troops. I swear, if you don’t, they’ll all ditch you by tonight. And that would be even worse than anything that’s happened before.”</w:t>
+              <w:t>But Joab went to the king privately and was like, “Seriously? You just embarrassed all your loyal soldiers who literally just saved your life, not to mention your whole family. What’s up with this? You’re loving the people who hate you and hating the people who love you? You’re basically telling everyone that your team means nothing to you. You know, if Absalom was alive right now, we’d all be dead—is that what you wanted? Get it together, man. Go out there and encourage your troops. II swear to God, if you don't, they'll all ditch you by tonight.And that would be even worse than anything that’s happened before.”</w:t>
             </w:r>
           </w:p>
         </w:tc>
@@ -25936,7 +25936,7 @@
               <w:rPr>
                 <w:sz w:val="18"/>
               </w:rPr>
-              <w:t>So the king headed back. He got to the Jordan River just as the people of Judah were arriving at Gilgal to welcome him and help him cross. Even Shimei, the guy from Bahurim who had cursed David, rushed down with a thousand guys from his tribe to welcome the king. And Ziba, Saul’s old servant, showed up with his fifteen sons and twenty servants. They crossed the Jordan to meet the king and did everything they could to help him and his group.</w:t>
+              <w:t>So the king headed back. He got to the Jordan River just as the people of Judah were arriving at Gilgal to welcome him and help him cross. Even Shimei son of Gera, the Benjaminite from Bahurim who had cursed David, rushed down with a thousand Benjaminites to welcome the king. And Ziba, Saul’s old servant, showed up with his fifteen sons and twenty servants. They crossed the Jordan to meet the king and did everything they could to help him and his group.</w:t>
             </w:r>
           </w:p>
         </w:tc>
@@ -26078,7 +26078,7 @@
               <w:rPr>
                 <w:sz w:val="18"/>
               </w:rPr>
-              <w:t>But Abishai, one of David’s nephews, cut in, “Hold up! Shouldn’t we just kill this guy? He cursed God’s chosen king!”</w:t>
+              <w:t>But Abishai son of Zeruiah cut in, “Hold up! Shouldn’t we just kill this guy? He cursed God’s chosen king!”</w:t>
             </w:r>
           </w:p>
         </w:tc>
@@ -26149,7 +26149,7 @@
               <w:rPr>
                 <w:sz w:val="18"/>
               </w:rPr>
-              <w:t>David shot back, “Why are you always trying to start something? No one is getting killed today. I’m king over Israel again!”</w:t>
+              <w:t>David shot back, "Why are you sons of Zeruiah always trying to start something? No one is getting killed today. I’m king over Israel again!”</w:t>
             </w:r>
           </w:p>
         </w:tc>
@@ -26575,7 +26575,7 @@
               <w:rPr>
                 <w:sz w:val="18"/>
               </w:rPr>
-              <w:t>Barzillai, a super old and rich guy from Gilead, also came down to see the king off. He was eighty years old and had been supplying the king with everything he needed while he was in Mahanaim.</w:t>
+              <w:t>Barzillai the Gileadite had come down from Rogelim to see the king off across the Jordan. He was eighty years old and had been supplying the king with everything he needed while he was in Mahanaim.</w:t>
             </w:r>
           </w:p>
         </w:tc>
@@ -27510,7 +27510,7 @@
               <w:rPr>
                 <w:sz w:val="18"/>
               </w:rPr>
-              <w:t>The king told Amasa, "Get the men of Judah together for me in three days, and then report back." Amasa went to gather the troops, but he was running late. So David said to Abishai, "This Sheba guy is gonna cause us even more trouble than Absalom. Take my best soldiers and hunt him down before he hides in a fortified city where we can't reach him." So, with Abishai in charge, all the elite fighters—Joab's men and the special forces, the Kerethites and Pelethites—left Jerusalem to chase after Sheba. They were near the big rock at Gibeon when Amasa showed up. Joab was in his uniform with a sword in its sheath at his waist, but the sword slipped out and fell. Joab walked up to Amasa and said, "What's up, bro?" and grabbed Amasa's beard with his right hand like he was going to give him a friendly kiss. Amasa didn't even see the sword in Joab's other hand. Joab stabbed him right in the stomach, and his guts spilled out onto the ground. He didn't need to strike him again; Amasa was dead. Then Joab and his brother Abishai kept chasing Sheba.</w:t>
+              <w:t>The king told Amasa, "Get the men of Judah together for me in three days, and then report back." Amasa went to gather the troops, but he was running late. So David said to Abishai, "Sheba son of Bicri is gonna cause us even more trouble than Absalom. Take my best soldiers and hunt him down before he hides in a fortified city where we can't reach him." So, with Abishai in charge, all the elite fighters—Joab's men and the special forces, the Kerethites and Pelethites—left Jerusalem to chase after Sheba. They were near the big rock at Gibeon when Amasa showed up. Joab was in his uniform with a sword in its sheath at his waist, but the sword slipped out and fell. Joab walked up to Amasa and said, "What's up, bro?" and grabbed Amasa's beard with his right hand like he was going to give him a friendly kiss. Amasa didn't even see the sword in Joab's other hand. Joab stabbed him right in the stomach, and his guts spilled out onto the ground. He didn't need to strike him again; Amasa was dead. Then Joab and his brother Abishai kept chasing Sheba.</w:t>
             </w:r>
           </w:p>
         </w:tc>
@@ -27533,7 +27533,7 @@
               <w:rPr>
                 <w:sz w:val="18"/>
               </w:rPr>
-              <w:t>왕이 아마사한테 명령했어. "사흘 안에 유다 군대를 소집해서 나한테 보고해라." 아마사가 명령을 수행하러 갔는데, 약속한 날보다 늦게 돌아온 거야. 그래서 다윗이 아비새한테 말했지. "세바가 압살롬보다 우리한테 더 큰 골칫거리가 되겠다. 내 부하들을 데리고 당장 쫓아가. 세바가 성벽 있는 도시에 숨어버리면 잡기 힘들어지니까." 그래서 아비새가 요압의 부하들이랑 그렛 사람, 블렛 사람 같은 최정예 부대를 이끌고 예루살렘을 떠나서 세바를 추격하기 시작했어. 기브온에 있는 큰 바위 근처에 이르렀을 때 아마사랑 마주쳤대. 요압은 군복을 입고 허리에 칼집에 꽂힌 칼을 차고 있었는데, 그 칼이 스르륵 빠져서 땅에 떨어졌어. 요압이 아마사한테 "형제여, 잘 지냈나?" 하고 인사하면서, 마치 뽀뽀라도 할 것처럼 오른손으로 아마사의 수염을 잡았지. 아마사는 요압의 다른 손에 칼이 들려있는 걸 눈치채지 못했어. 요압은 그대로 아마사의 배를 찔렀고, 내장이 땅바닥으로 쏟아져 나왔대. 두 번 찌를 필요도 없이 즉사한 거지. 그러고 나서 요압이랑 그의 동생 아비새는 계속해서 세바를 쫓아갔어.</w:t>
+              <w:t>왕이 아마사한테 명령했어. "사흘 안에 유다 군대를 소집해서 나한테 보고해라." 아마사가 명령을 수행하러 갔는데, 약속한 날보다 늦게 돌아온 거야. 그래서 다윗이 아비새한테 말했지. "비그리의 아들 세바가 압살롬보다 우리한테 더 큰 골칫거리가 되겠다. 내 부하들을 데리고 당장 쫓아가. 세바가 성벽 있는 도시에 숨어버리면 잡기 힘들어지니까." 그래서 아비새가 요압의 부하들이랑 그렛 사람, 블렛 사람 같은 최정예 부대를 이끌고 예루살렘을 떠나서 세바를 추격하기 시작했어. 기브온에 있는 큰 바위 근처에 이르렀을 때 아마사랑 마주쳤대. 요압은 군복을 입고 허리에 칼집에 꽂힌 칼을 차고 있었는데, 그 칼이 스르륵 빠져서 땅에 떨어졌어. 요압이 아마사한테 "형제여, 잘 지냈나?" 하고 인사하면서, 마치 뽀뽀라도 할 것처럼 오른손으로 아마사의 수염을 잡았지. 아마사는 요압의 다른 손에 칼이 들려있는 걸 눈치채지 못했어. 요압은 그대로 아마사의 배를 찔렀고, 내장이 땅바닥으로 쏟아져 나왔대. 두 번 찌를 필요도 없이 즉사한 거지. 그러고 나서 요압이랑 그의 동생 아비새는 계속해서 세바를 쫓아갔어.</w:t>
             </w:r>
           </w:p>
         </w:tc>
@@ -28252,7 +28252,7 @@
               <w:rPr>
                 <w:sz w:val="18"/>
               </w:rPr>
-              <w:t>The woman went and explained her plan to the whole city, and they did it. They cut off Sheba's head and tossed it down to Joab. He blew the ram's horn, and all the soldiers packed up and went home. Joab then went back to the king in Jerusalem.</w:t>
+              <w:t>The woman went and explained her plan to the whole city, and they did it. They cut off the head of Sheba son of Bicri and tossed it down to Joab. He blew the ram's horn, and all the soldiers packed up and went home. Joab then went back to the king in Jerusalem.</w:t>
             </w:r>
           </w:p>
         </w:tc>
@@ -28275,7 +28275,7 @@
               <w:rPr>
                 <w:sz w:val="18"/>
               </w:rPr>
-              <w:t>여자는 성 안으로 들어가서 모든 사람들에게 자기 계획을 설명했고, 사람들은 그대로 실행했어. 그들은 세바의 목을 베어 요압에게 던져줬지. 요압이 뿔나팔을 불자 군인들은 모두 집으로 돌아갔어. 그리고 요압은 예루살렘에 있는 왕에게 돌아갔지.</w:t>
+              <w:t>여자는 성 안으로 들어가서 모든 사람들에게 자기 계획을 설명했고, 사람들은 그대로 실행했어. 그들은 비그리의 아들 세바의 목을 베어 요압에게 던져줬지. 요압이 뿔나팔을 불자 군인들은 모두 집으로 돌아갔어. 그리고 요압은 예루살렘에 있는 왕에게 돌아갔지.</w:t>
             </w:r>
           </w:p>
         </w:tc>
@@ -28982,7 +28982,7 @@
               <w:rPr>
                 <w:sz w:val="18"/>
               </w:rPr>
-              <w:t>The king spared Mephibosheth, Jonathan's son and Saul's grandson, because of the promise he and Jonathan made before God. But he took Armoni and Mephibosheth, the two sons Rizpah daughter of Aiah had with Saul, and the five sons of Saul's daughter Merab. He handed them over to the Gibeonites, who hanged all seven of them on the mountain before God. They all died together, right when the barley harvest was starting.</w:t>
+              <w:t>The king spared Mephibosheth, Jonathan's son and Saul's grandson, because of the promise he and Jonathan made before God. But he took Armoni and Mephibosheth, the two sons Rizpah daughter of Aiah had with Saul, and the five sons that Saul's daughter Merab had with Adriel son of Barzillai the Meholathite. He handed them over to the Gibeonites, who hanged all seven of them on the mountain before God. They all died together, right when the barley harvest was starting.</w:t>
             </w:r>
           </w:p>
         </w:tc>
@@ -29005,7 +29005,7 @@
               <w:rPr>
                 <w:sz w:val="18"/>
               </w:rPr>
-              <w:t>왕은 요나단의 아들이자 사울의 손자인 므비보셋은 살려줬어. 왜냐면 다윗이랑 요나단이 하나님 앞에서 한 약속이 있었거든. 대신에 왕은 아야의 딸 리스바가 사울한테 낳아준 두 아들, 아르모니랑 므비보셋, 그리고 사울의 딸 메랍이 낳은 다섯 아들을 골랐어. 그들을 기브온 사람들한테 넘겨줬고, 기브온 사람들은 그 일곱 명을 산에서 하나님 앞에 목매달아 죽였대. 그들이 죽었을 때가 마침 보리 수확을 시작할 때였다고 함.</w:t>
+              <w:t>왕은 요나단의 아들이자 사울의 손자인 므비보셋은 살려줬어. 왜냐면 다윗이랑 요나단이 하나님 앞에서 한 약속이 있었거든. 대신에 왕은 아야의 딸 리스바가 사울한테 낳아준 두 아들, 아르모니랑 므비보셋, 그리고 사울의 딸 메랍이 므홀라 사람 브실래의 아들 아드리엘에게 낳은 다섯 아들을 골랐어. 그들을 기브온 사람들한테 넘겨줬고, 기브온 사람들은 그 일곱 명을 산에서 하나님 앞에 목매달아 죽였대. 그들이 죽었을 때가 마침 보리 수확을 시작할 때였다고 함.</w:t>
             </w:r>
           </w:p>
         </w:tc>
@@ -29132,7 +29132,7 @@
               <w:rPr>
                 <w:sz w:val="18"/>
               </w:rPr>
-              <w:t>Someone told David what Rizpah, Saul's concubine, had done. So he went and got the bones of Saul and his son Jonathan from the leaders of Jabesh Gilead (they had snatched their bodies from the town square in Beth Shan where the Philistines had hung them). He gathered their remains and the bodies of the seven who were just hanged. They took the bodies back to the land of Benjamin and gave them a proper burial in the tomb of Kish, Saul's father.</w:t>
+              <w:t>Someone told David what Rizpah daughter of Aiah, Saul's concubine, had done. So he went and got the bones of Saul and his son Jonathan from the leaders of Jabesh Gilead (they had snatched their bodies from the town square in Beth Shan where the Philistines had hung them after striking them down at Gilboa). He gathered their remains and the bodies of the seven who were just hanged. They took the bodies back to the land of Benjamin and gave them a proper burial in the tomb of Kish, Saul's father.</w:t>
             </w:r>
           </w:p>
         </w:tc>
@@ -29155,7 +29155,7 @@
               <w:rPr>
                 <w:sz w:val="18"/>
               </w:rPr>
-              <w:t>사울의 첩이었던 리스바가 한 일이 다윗한테 전해졌어. 다윗은 길르앗 야베스 지도자들한테 가서 사울과 그의 아들 요나단의 뼈를 가져왔어. (전에 블레셋 사람들이 길보아에서 사울과 요나단을 죽이고 벧산 광장에 매달아 놨었는데, 길르앗 야베스 사람들이 그걸 구해왔었거든.) 다윗은 그 뼈들이랑, 방금 목매달려 죽은 일곱 명의 시체를 다 모았어. 그리고 그 시체들을 베냐민 땅으로 가져가서 사울의 아버지 기스의 무덤에 잘 묻어줬대.</w:t>
+              <w:t>사울의 첩이었던 아야의 딸 리스바가 한 일이 다윗한테 전해졌어. 다윗은 길르앗 야베스 지도자들한테 가서 사울과 그의 아들 요나단의 뼈를 가져왔어. (전에 블레셋 사람들이 길보아에서 사울과 요나단을 죽이고 벧산 광장에 매달아 놨었는데, 길르앗 야베스 사람들이 그걸 구해왔었거든.) 다윗은 그 뼈들이랑, 방금 목매달려 죽은 일곱 명의 시체를 다 모았어. 그리고 그 시체들을 베냐민 땅으로 가져가서 사울의 아버지 기스의 무덤에 잘 묻어줬대.</w:t>
             </w:r>
           </w:p>
         </w:tc>
@@ -29566,7 +29566,7 @@
               <w:rPr>
                 <w:sz w:val="18"/>
               </w:rPr>
-              <w:t>There was another fight in Gath. This time there was a giant who had six fingers on each hand and six toes on each foot—twenty-four in total! He was also a descendant of Rapha. He started dissing Israel, so Jonathan, David's nephew, killed him.</w:t>
+              <w:t>There was another fight in Gath. This time there was a giant who had six fingers on each hand and six toes on each foot—twenty-four in total! He was also a descendant of Rapha. He started dissing Israel, sso Jonathan son of Shimeah, David's nephew, killed him.</w:t>
             </w:r>
           </w:p>
         </w:tc>
@@ -33917,7 +33917,7 @@
               <w:rPr>
                 <w:sz w:val="18"/>
               </w:rPr>
-              <w:t>So, God was seriously ticked off at Israel again. He decided to test David and basically whispered in his ear, 'Yo, go count everyone in Israel and Judah.' So David, probably not thinking it through, tells his top general Joab, 'Alright, go do a headcount of the whole country, from top to bottom. I wanna see the numbers.'</w:t>
+              <w:t>So, God was seriously ticked off at Israel again. He decided to test David and basically whispered in his ear, 'Yo, go count everyone in Israel and Judah.' So David, probably not thinking it through, tells his top general Joab, 'Alright, go do a headcount of all the tribes of Israel, from Dan to Beersheba. I wanna see the numbers.'</w:t>
             </w:r>
           </w:p>
         </w:tc>
@@ -34059,7 +34059,7 @@
               <w:rPr>
                 <w:sz w:val="18"/>
               </w:rPr>
-              <w:t>But David wouldn't back down. He was like, 'Just do it.' So Joab and his crew had to bounce and start the census. They went all over the country, a whole road trip that took over nine months. When they got back to Jerusalem, Joab gave David the stats: 800,000 guys ready to fight in Israel, and 500,000 in Judah. That's a lot of dudes.</w:t>
+              <w:t>But David wouldn't back down. He was like, 'Just do it.' So Joab and his crew had to bounce and start the census. They crossed the Jordan and started with Aroer and the town in the canyon of the Gadites near Jazer, went through Gilead, passed Hermon, then on to Dan but detoured around Sidon. They covered Fort Tyre and all the Hivite and Canaanite cities, and finally reached the Negev of Judah at Beersheba. The whole road trip took nine months and twenty days. When they got back to Jerusalem, Joab gave David the stats: 800,000 guys ready to fight in Israel, and 500,000 in Judah. That's a lot of dudes.</w:t>
             </w:r>
           </w:p>
         </w:tc>
@@ -34422,7 +34422,7 @@
               <w:rPr>
                 <w:sz w:val="18"/>
               </w:rPr>
-              <w:t>So God sent a plague that lasted from morning till evening. It was a total disaster. 70,000 people died. But just as the angel was about to wreck Jerusalem, God was like, 'Okay, that's enough. Stop.'</w:t>
+              <w:t>So God sent a plague that lasted from morning till evening. It was a total disaster. From Dan to Beersheba, 70,000 people died. But just as the angel was about to wreck Jerusalem, God was like, 'Okay, that's enough. Stop.'</w:t>
             </w:r>
           </w:p>
         </w:tc>
@@ -34635,7 +34635,7 @@
               <w:rPr>
                 <w:sz w:val="18"/>
               </w:rPr>
-              <w:t>That same day, Gad came to David and said, 'Go build an altar to God on Araunah's threshing floor.' So David did what Gad said, just like God told him to.</w:t>
+              <w:t>That same day, Gad came to David and said, 'Go build an altar to God on the threshing floor of Araunah the Jebusite.' So David did what Gad said, just like God told him to.</w:t>
             </w:r>
           </w:p>
         </w:tc>

</xml_diff>

<commit_message>
2Samuel 배지 정밀화 (OT 전수조사): ch12 배지 캐스케이드 5문단 + ch23 'The Thirty' 명단 1절 오프셋 21문단 (EN+KO). 독스 24/24 export-back OK.
</commit_message>
<xml_diff>
--- a/gdocs_build/2Samuel.docx
+++ b/gdocs_build/2Samuel.docx
@@ -14144,30 +14144,30 @@
                 <w:b/>
                 <w:sz w:val="16"/>
               </w:rPr>
-              <w:t>20</w:t>
-            </w:r>
-          </w:p>
-          <w:p>
-            <w:r>
-              <w:rPr>
-                <w:sz w:val="18"/>
-              </w:rPr>
-              <w:t>David got up from the floor, washed his face and combed his hair, put on a fresh change of clothes, then went into the sanctuary and worshiped. Then he came home and asked for something to eat. They set it before him and he ate.</w:t>
-            </w:r>
-          </w:p>
-        </w:tc>
-        <w:tc>
-          <w:tcPr>
-            <w:tcW w:type="dxa" w:w="2880"/>
-          </w:tcPr>
-          <w:p>
-            <w:r/>
-            <w:r>
-              <w:rPr>
-                <w:b/>
-                <w:sz w:val="16"/>
-              </w:rPr>
-              <w:t>20</w:t>
+              <w:t>19</w:t>
+            </w:r>
+          </w:p>
+          <w:p>
+            <w:r>
+              <w:rPr>
+                <w:sz w:val="18"/>
+              </w:rPr>
+              <w:t>↑ 위 MSG(19-19) 계속</w:t>
+            </w:r>
+          </w:p>
+        </w:tc>
+        <w:tc>
+          <w:tcPr>
+            <w:tcW w:type="dxa" w:w="2880"/>
+          </w:tcPr>
+          <w:p>
+            <w:r/>
+            <w:r>
+              <w:rPr>
+                <w:b/>
+                <w:sz w:val="16"/>
+              </w:rPr>
+              <w:t>19</w:t>
             </w:r>
           </w:p>
           <w:p>
@@ -14190,7 +14190,7 @@
                 <w:b/>
                 <w:sz w:val="16"/>
               </w:rPr>
-              <w:t>20</w:t>
+              <w:t>19</w:t>
             </w:r>
           </w:p>
           <w:p>
@@ -14215,30 +14215,30 @@
                 <w:b/>
                 <w:sz w:val="16"/>
               </w:rPr>
-              <w:t>21</w:t>
-            </w:r>
-          </w:p>
-          <w:p>
-            <w:r>
-              <w:rPr>
-                <w:sz w:val="18"/>
-              </w:rPr>
-              <w:t>His servants asked him, "What's going on with you? While the child was alive you fasted and wept and stayed up all night. Now that he's dead, you get up and eat."</w:t>
-            </w:r>
-          </w:p>
-        </w:tc>
-        <w:tc>
-          <w:tcPr>
-            <w:tcW w:type="dxa" w:w="2880"/>
-          </w:tcPr>
-          <w:p>
-            <w:r/>
-            <w:r>
-              <w:rPr>
-                <w:b/>
-                <w:sz w:val="16"/>
-              </w:rPr>
-              <w:t>21</w:t>
+              <w:t>19</w:t>
+            </w:r>
+          </w:p>
+          <w:p>
+            <w:r>
+              <w:rPr>
+                <w:sz w:val="18"/>
+              </w:rPr>
+              <w:t>↑ 위 MSG(19-19) 계속</w:t>
+            </w:r>
+          </w:p>
+        </w:tc>
+        <w:tc>
+          <w:tcPr>
+            <w:tcW w:type="dxa" w:w="2880"/>
+          </w:tcPr>
+          <w:p>
+            <w:r/>
+            <w:r>
+              <w:rPr>
+                <w:b/>
+                <w:sz w:val="16"/>
+              </w:rPr>
+              <w:t>19</w:t>
             </w:r>
           </w:p>
           <w:p>
@@ -14261,7 +14261,7 @@
                 <w:b/>
                 <w:sz w:val="16"/>
               </w:rPr>
-              <w:t>21</w:t>
+              <w:t>19</w:t>
             </w:r>
           </w:p>
           <w:p>
@@ -14286,30 +14286,30 @@
                 <w:b/>
                 <w:sz w:val="16"/>
               </w:rPr>
-              <w:t>22-23</w:t>
-            </w:r>
-          </w:p>
-          <w:p>
-            <w:r>
-              <w:rPr>
-                <w:sz w:val="18"/>
-              </w:rPr>
-              <w:t>"While the child was alive," he said, "I fasted and wept, thinking God might have mercy on me and the child would live. But now that he's dead, why fast? Can I bring him back now? I can go to him, but he can't come to me."</w:t>
-            </w:r>
-          </w:p>
-        </w:tc>
-        <w:tc>
-          <w:tcPr>
-            <w:tcW w:type="dxa" w:w="2880"/>
-          </w:tcPr>
-          <w:p>
-            <w:r/>
-            <w:r>
-              <w:rPr>
-                <w:b/>
-                <w:sz w:val="16"/>
-              </w:rPr>
-              <w:t>22-23</w:t>
+              <w:t>20</w:t>
+            </w:r>
+          </w:p>
+          <w:p>
+            <w:r>
+              <w:rPr>
+                <w:sz w:val="18"/>
+              </w:rPr>
+              <w:t>David got up from the floor, washed his face and combed his hair, put on a fresh change of clothes, then went into the sanctuary and worshiped. Then he came home and asked for something to eat. They set it before him and he ate.</w:t>
+            </w:r>
+          </w:p>
+        </w:tc>
+        <w:tc>
+          <w:tcPr>
+            <w:tcW w:type="dxa" w:w="2880"/>
+          </w:tcPr>
+          <w:p>
+            <w:r/>
+            <w:r>
+              <w:rPr>
+                <w:b/>
+                <w:sz w:val="16"/>
+              </w:rPr>
+              <w:t>20</w:t>
             </w:r>
           </w:p>
           <w:p>
@@ -14332,7 +14332,7 @@
                 <w:b/>
                 <w:sz w:val="16"/>
               </w:rPr>
-              <w:t>22-23</w:t>
+              <w:t>20</w:t>
             </w:r>
           </w:p>
           <w:p>
@@ -14357,30 +14357,30 @@
                 <w:b/>
                 <w:sz w:val="16"/>
               </w:rPr>
-              <w:t>22-23</w:t>
-            </w:r>
-          </w:p>
-          <w:p>
-            <w:r>
-              <w:rPr>
-                <w:sz w:val="18"/>
-              </w:rPr>
-              <w:t>↑ 위 MSG(22-23) 계속</w:t>
-            </w:r>
-          </w:p>
-        </w:tc>
-        <w:tc>
-          <w:tcPr>
-            <w:tcW w:type="dxa" w:w="2880"/>
-          </w:tcPr>
-          <w:p>
-            <w:r/>
-            <w:r>
-              <w:rPr>
-                <w:b/>
-                <w:sz w:val="16"/>
-              </w:rPr>
-              <w:t>22-23</w:t>
+              <w:t>21</w:t>
+            </w:r>
+          </w:p>
+          <w:p>
+            <w:r>
+              <w:rPr>
+                <w:sz w:val="18"/>
+              </w:rPr>
+              <w:t>His servants asked him, "What's going on with you? While the child was alive you fasted and wept and stayed up all night. Now that he's dead, you get up and eat."</w:t>
+            </w:r>
+          </w:p>
+        </w:tc>
+        <w:tc>
+          <w:tcPr>
+            <w:tcW w:type="dxa" w:w="2880"/>
+          </w:tcPr>
+          <w:p>
+            <w:r/>
+            <w:r>
+              <w:rPr>
+                <w:b/>
+                <w:sz w:val="16"/>
+              </w:rPr>
+              <w:t>21</w:t>
             </w:r>
           </w:p>
           <w:p>
@@ -14403,7 +14403,7 @@
                 <w:b/>
                 <w:sz w:val="16"/>
               </w:rPr>
-              <w:t>22-23</w:t>
+              <w:t>21</w:t>
             </w:r>
           </w:p>
           <w:p>
@@ -14428,30 +14428,30 @@
                 <w:b/>
                 <w:sz w:val="16"/>
               </w:rPr>
-              <w:t>24-25</w:t>
-            </w:r>
-          </w:p>
-          <w:p>
-            <w:r>
-              <w:rPr>
-                <w:sz w:val="18"/>
-              </w:rPr>
-              <w:t>David went and comforted his wife Bathsheba. And when he slept with her, they conceived a son. When he was born they named him Solomon. God had a special love for him and sent word by Nathan the prophet that God wanted him named Jedidiah (God's Beloved).</w:t>
-            </w:r>
-          </w:p>
-        </w:tc>
-        <w:tc>
-          <w:tcPr>
-            <w:tcW w:type="dxa" w:w="2880"/>
-          </w:tcPr>
-          <w:p>
-            <w:r/>
-            <w:r>
-              <w:rPr>
-                <w:b/>
-                <w:sz w:val="16"/>
-              </w:rPr>
-              <w:t>24-25</w:t>
+              <w:t>22-23</w:t>
+            </w:r>
+          </w:p>
+          <w:p>
+            <w:r>
+              <w:rPr>
+                <w:sz w:val="18"/>
+              </w:rPr>
+              <w:t>"While the child was alive," he said, "I fasted and wept, thinking God might have mercy on me and the child would live. But now that he's dead, why fast? Can I bring him back now? I can go to him, but he can't come to me."</w:t>
+            </w:r>
+          </w:p>
+        </w:tc>
+        <w:tc>
+          <w:tcPr>
+            <w:tcW w:type="dxa" w:w="2880"/>
+          </w:tcPr>
+          <w:p>
+            <w:r/>
+            <w:r>
+              <w:rPr>
+                <w:b/>
+                <w:sz w:val="16"/>
+              </w:rPr>
+              <w:t>22-23</w:t>
             </w:r>
           </w:p>
           <w:p>
@@ -14474,7 +14474,7 @@
                 <w:b/>
                 <w:sz w:val="16"/>
               </w:rPr>
-              <w:t>24-25</w:t>
+              <w:t>22-23</w:t>
             </w:r>
           </w:p>
           <w:p>
@@ -14507,7 +14507,7 @@
               <w:rPr>
                 <w:sz w:val="18"/>
               </w:rPr>
-              <w:t>↑ 위 MSG(24-25) 계속</w:t>
+              <w:t>David went and comforted his wife Bathsheba. And when he slept with her, they conceived a son. When he was born they named him Solomon. God had a special love for him and sent word by Nathan the prophet that God wanted him named Jedidiah (God's Beloved).</w:t>
             </w:r>
           </w:p>
         </w:tc>
@@ -31618,7 +31618,7 @@
                 <w:b/>
                 <w:sz w:val="16"/>
               </w:rPr>
-              <w:t>24-39</w:t>
+              <w:t>24</w:t>
             </w:r>
           </w:p>
           <w:p>
@@ -31641,7 +31641,7 @@
                 <w:b/>
                 <w:sz w:val="16"/>
               </w:rPr>
-              <w:t>24-39</w:t>
+              <w:t>24</w:t>
             </w:r>
           </w:p>
           <w:p>
@@ -31664,7 +31664,7 @@
                 <w:b/>
                 <w:sz w:val="16"/>
               </w:rPr>
-              <w:t>24-39</w:t>
+              <w:t>24</w:t>
             </w:r>
           </w:p>
           <w:p>
@@ -31689,7 +31689,7 @@
                 <w:b/>
                 <w:sz w:val="16"/>
               </w:rPr>
-              <w:t>25</w:t>
+              <w:t>24</w:t>
             </w:r>
           </w:p>
           <w:p>
@@ -31712,7 +31712,7 @@
                 <w:b/>
                 <w:sz w:val="16"/>
               </w:rPr>
-              <w:t>25</w:t>
+              <w:t>24</w:t>
             </w:r>
           </w:p>
           <w:p>
@@ -31735,7 +31735,7 @@
                 <w:b/>
                 <w:sz w:val="16"/>
               </w:rPr>
-              <w:t>25</w:t>
+              <w:t>24</w:t>
             </w:r>
           </w:p>
           <w:p>
@@ -31760,7 +31760,7 @@
                 <w:b/>
                 <w:sz w:val="16"/>
               </w:rPr>
-              <w:t>26</w:t>
+              <w:t>25</w:t>
             </w:r>
           </w:p>
           <w:p>
@@ -31783,7 +31783,7 @@
                 <w:b/>
                 <w:sz w:val="16"/>
               </w:rPr>
-              <w:t>26</w:t>
+              <w:t>25</w:t>
             </w:r>
           </w:p>
           <w:p>
@@ -31806,7 +31806,7 @@
                 <w:b/>
                 <w:sz w:val="16"/>
               </w:rPr>
-              <w:t>26</w:t>
+              <w:t>25</w:t>
             </w:r>
           </w:p>
           <w:p>
@@ -31831,7 +31831,7 @@
                 <w:b/>
                 <w:sz w:val="16"/>
               </w:rPr>
-              <w:t>26</w:t>
+              <w:t>25</w:t>
             </w:r>
           </w:p>
           <w:p>
@@ -31854,7 +31854,7 @@
                 <w:b/>
                 <w:sz w:val="16"/>
               </w:rPr>
-              <w:t>26</w:t>
+              <w:t>25</w:t>
             </w:r>
           </w:p>
           <w:p>
@@ -31877,7 +31877,7 @@
                 <w:b/>
                 <w:sz w:val="16"/>
               </w:rPr>
-              <w:t>26</w:t>
+              <w:t>25</w:t>
             </w:r>
           </w:p>
           <w:p>
@@ -31902,7 +31902,7 @@
                 <w:b/>
                 <w:sz w:val="16"/>
               </w:rPr>
-              <w:t>27</w:t>
+              <w:t>26</w:t>
             </w:r>
           </w:p>
           <w:p>
@@ -31925,7 +31925,7 @@
                 <w:b/>
                 <w:sz w:val="16"/>
               </w:rPr>
-              <w:t>27</w:t>
+              <w:t>26</w:t>
             </w:r>
           </w:p>
           <w:p>
@@ -31948,7 +31948,7 @@
                 <w:b/>
                 <w:sz w:val="16"/>
               </w:rPr>
-              <w:t>27</w:t>
+              <w:t>26</w:t>
             </w:r>
           </w:p>
           <w:p>
@@ -31973,7 +31973,7 @@
                 <w:b/>
                 <w:sz w:val="16"/>
               </w:rPr>
-              <w:t>27</w:t>
+              <w:t>26</w:t>
             </w:r>
           </w:p>
           <w:p>
@@ -31996,7 +31996,7 @@
                 <w:b/>
                 <w:sz w:val="16"/>
               </w:rPr>
-              <w:t>27</w:t>
+              <w:t>26</w:t>
             </w:r>
           </w:p>
           <w:p>
@@ -32019,7 +32019,7 @@
                 <w:b/>
                 <w:sz w:val="16"/>
               </w:rPr>
-              <w:t>27</w:t>
+              <w:t>26</w:t>
             </w:r>
           </w:p>
           <w:p>
@@ -32044,7 +32044,7 @@
                 <w:b/>
                 <w:sz w:val="16"/>
               </w:rPr>
-              <w:t>28</w:t>
+              <w:t>27</w:t>
             </w:r>
           </w:p>
           <w:p>
@@ -32067,7 +32067,7 @@
                 <w:b/>
                 <w:sz w:val="16"/>
               </w:rPr>
-              <w:t>28</w:t>
+              <w:t>27</w:t>
             </w:r>
           </w:p>
           <w:p>
@@ -32090,7 +32090,7 @@
                 <w:b/>
                 <w:sz w:val="16"/>
               </w:rPr>
-              <w:t>28</w:t>
+              <w:t>27</w:t>
             </w:r>
           </w:p>
           <w:p>
@@ -32115,7 +32115,7 @@
                 <w:b/>
                 <w:sz w:val="16"/>
               </w:rPr>
-              <w:t>28</w:t>
+              <w:t>27</w:t>
             </w:r>
           </w:p>
           <w:p>
@@ -32138,7 +32138,7 @@
                 <w:b/>
                 <w:sz w:val="16"/>
               </w:rPr>
-              <w:t>28</w:t>
+              <w:t>27</w:t>
             </w:r>
           </w:p>
           <w:p>
@@ -32161,7 +32161,7 @@
                 <w:b/>
                 <w:sz w:val="16"/>
               </w:rPr>
-              <w:t>28</w:t>
+              <w:t>27</w:t>
             </w:r>
           </w:p>
           <w:p>
@@ -32186,7 +32186,7 @@
                 <w:b/>
                 <w:sz w:val="16"/>
               </w:rPr>
-              <w:t>29</w:t>
+              <w:t>28</w:t>
             </w:r>
           </w:p>
           <w:p>
@@ -32209,7 +32209,7 @@
                 <w:b/>
                 <w:sz w:val="16"/>
               </w:rPr>
-              <w:t>29</w:t>
+              <w:t>28</w:t>
             </w:r>
           </w:p>
           <w:p>
@@ -32232,7 +32232,7 @@
                 <w:b/>
                 <w:sz w:val="16"/>
               </w:rPr>
-              <w:t>29</w:t>
+              <w:t>28</w:t>
             </w:r>
           </w:p>
           <w:p>
@@ -32257,7 +32257,7 @@
                 <w:b/>
                 <w:sz w:val="16"/>
               </w:rPr>
-              <w:t>29</w:t>
+              <w:t>28</w:t>
             </w:r>
           </w:p>
           <w:p>
@@ -32280,7 +32280,7 @@
                 <w:b/>
                 <w:sz w:val="16"/>
               </w:rPr>
-              <w:t>29</w:t>
+              <w:t>28</w:t>
             </w:r>
           </w:p>
           <w:p>
@@ -32303,7 +32303,7 @@
                 <w:b/>
                 <w:sz w:val="16"/>
               </w:rPr>
-              <w:t>29</w:t>
+              <w:t>28</w:t>
             </w:r>
           </w:p>
           <w:p>
@@ -32328,7 +32328,7 @@
                 <w:b/>
                 <w:sz w:val="16"/>
               </w:rPr>
-              <w:t>30</w:t>
+              <w:t>29</w:t>
             </w:r>
           </w:p>
           <w:p>
@@ -32351,7 +32351,7 @@
                 <w:b/>
                 <w:sz w:val="16"/>
               </w:rPr>
-              <w:t>30</w:t>
+              <w:t>29</w:t>
             </w:r>
           </w:p>
           <w:p>
@@ -32374,7 +32374,7 @@
                 <w:b/>
                 <w:sz w:val="16"/>
               </w:rPr>
-              <w:t>30</w:t>
+              <w:t>29</w:t>
             </w:r>
           </w:p>
           <w:p>
@@ -32399,7 +32399,7 @@
                 <w:b/>
                 <w:sz w:val="16"/>
               </w:rPr>
-              <w:t>30</w:t>
+              <w:t>29</w:t>
             </w:r>
           </w:p>
           <w:p>
@@ -32422,7 +32422,7 @@
                 <w:b/>
                 <w:sz w:val="16"/>
               </w:rPr>
-              <w:t>30</w:t>
+              <w:t>29</w:t>
             </w:r>
           </w:p>
           <w:p>
@@ -32445,7 +32445,7 @@
                 <w:b/>
                 <w:sz w:val="16"/>
               </w:rPr>
-              <w:t>30</w:t>
+              <w:t>29</w:t>
             </w:r>
           </w:p>
           <w:p>
@@ -32470,7 +32470,7 @@
                 <w:b/>
                 <w:sz w:val="16"/>
               </w:rPr>
-              <w:t>31</w:t>
+              <w:t>30</w:t>
             </w:r>
           </w:p>
           <w:p>
@@ -32493,7 +32493,7 @@
                 <w:b/>
                 <w:sz w:val="16"/>
               </w:rPr>
-              <w:t>31</w:t>
+              <w:t>30</w:t>
             </w:r>
           </w:p>
           <w:p>
@@ -32516,7 +32516,7 @@
                 <w:b/>
                 <w:sz w:val="16"/>
               </w:rPr>
-              <w:t>31</w:t>
+              <w:t>30</w:t>
             </w:r>
           </w:p>
           <w:p>
@@ -32541,7 +32541,7 @@
                 <w:b/>
                 <w:sz w:val="16"/>
               </w:rPr>
-              <w:t>31</w:t>
+              <w:t>30</w:t>
             </w:r>
           </w:p>
           <w:p>
@@ -32564,7 +32564,7 @@
                 <w:b/>
                 <w:sz w:val="16"/>
               </w:rPr>
-              <w:t>31</w:t>
+              <w:t>30</w:t>
             </w:r>
           </w:p>
           <w:p>
@@ -32587,7 +32587,7 @@
                 <w:b/>
                 <w:sz w:val="16"/>
               </w:rPr>
-              <w:t>31</w:t>
+              <w:t>30</w:t>
             </w:r>
           </w:p>
           <w:p>
@@ -32612,7 +32612,7 @@
                 <w:b/>
                 <w:sz w:val="16"/>
               </w:rPr>
-              <w:t>32</w:t>
+              <w:t>31</w:t>
             </w:r>
           </w:p>
           <w:p>
@@ -32635,7 +32635,7 @@
                 <w:b/>
                 <w:sz w:val="16"/>
               </w:rPr>
-              <w:t>32</w:t>
+              <w:t>31</w:t>
             </w:r>
           </w:p>
           <w:p>
@@ -32658,7 +32658,7 @@
                 <w:b/>
                 <w:sz w:val="16"/>
               </w:rPr>
-              <w:t>32</w:t>
+              <w:t>31</w:t>
             </w:r>
           </w:p>
           <w:p>
@@ -32683,7 +32683,7 @@
                 <w:b/>
                 <w:sz w:val="16"/>
               </w:rPr>
-              <w:t>32</w:t>
+              <w:t>31</w:t>
             </w:r>
           </w:p>
           <w:p>
@@ -32706,7 +32706,7 @@
                 <w:b/>
                 <w:sz w:val="16"/>
               </w:rPr>
-              <w:t>32</w:t>
+              <w:t>31</w:t>
             </w:r>
           </w:p>
           <w:p>
@@ -32729,7 +32729,7 @@
                 <w:b/>
                 <w:sz w:val="16"/>
               </w:rPr>
-              <w:t>32</w:t>
+              <w:t>31</w:t>
             </w:r>
           </w:p>
           <w:p>
@@ -32754,7 +32754,7 @@
                 <w:b/>
                 <w:sz w:val="16"/>
               </w:rPr>
-              <w:t>33</w:t>
+              <w:t>32</w:t>
             </w:r>
           </w:p>
           <w:p>
@@ -32777,7 +32777,7 @@
                 <w:b/>
                 <w:sz w:val="16"/>
               </w:rPr>
-              <w:t>33</w:t>
+              <w:t>32</w:t>
             </w:r>
           </w:p>
           <w:p>
@@ -32800,7 +32800,7 @@
                 <w:b/>
                 <w:sz w:val="16"/>
               </w:rPr>
-              <w:t>33</w:t>
+              <w:t>32</w:t>
             </w:r>
           </w:p>
           <w:p>
@@ -32825,7 +32825,7 @@
                 <w:b/>
                 <w:sz w:val="16"/>
               </w:rPr>
-              <w:t>33</w:t>
+              <w:t>32</w:t>
             </w:r>
           </w:p>
           <w:p>
@@ -32848,7 +32848,7 @@
                 <w:b/>
                 <w:sz w:val="16"/>
               </w:rPr>
-              <w:t>33</w:t>
+              <w:t>32</w:t>
             </w:r>
           </w:p>
           <w:p>
@@ -32871,7 +32871,7 @@
                 <w:b/>
                 <w:sz w:val="16"/>
               </w:rPr>
-              <w:t>33</w:t>
+              <w:t>32</w:t>
             </w:r>
           </w:p>
           <w:p>
@@ -32896,7 +32896,7 @@
                 <w:b/>
                 <w:sz w:val="16"/>
               </w:rPr>
-              <w:t>33</w:t>
+              <w:t>32</w:t>
             </w:r>
           </w:p>
           <w:p>
@@ -32919,7 +32919,7 @@
                 <w:b/>
                 <w:sz w:val="16"/>
               </w:rPr>
-              <w:t>33</w:t>
+              <w:t>32</w:t>
             </w:r>
           </w:p>
           <w:p>
@@ -32942,7 +32942,7 @@
                 <w:b/>
                 <w:sz w:val="16"/>
               </w:rPr>
-              <w:t>33</w:t>
+              <w:t>32</w:t>
             </w:r>
           </w:p>
           <w:p>
@@ -32967,7 +32967,7 @@
                 <w:b/>
                 <w:sz w:val="16"/>
               </w:rPr>
-              <w:t>34</w:t>
+              <w:t>33</w:t>
             </w:r>
           </w:p>
           <w:p>
@@ -32990,7 +32990,7 @@
                 <w:b/>
                 <w:sz w:val="16"/>
               </w:rPr>
-              <w:t>34</w:t>
+              <w:t>33</w:t>
             </w:r>
           </w:p>
           <w:p>
@@ -33013,7 +33013,7 @@
                 <w:b/>
                 <w:sz w:val="16"/>
               </w:rPr>
-              <w:t>34</w:t>
+              <w:t>33</w:t>
             </w:r>
           </w:p>
           <w:p>
@@ -33109,7 +33109,7 @@
                 <w:b/>
                 <w:sz w:val="16"/>
               </w:rPr>
-              <w:t>35</w:t>
+              <w:t>34</w:t>
             </w:r>
           </w:p>
           <w:p>
@@ -33132,7 +33132,7 @@
                 <w:b/>
                 <w:sz w:val="16"/>
               </w:rPr>
-              <w:t>35</w:t>
+              <w:t>34</w:t>
             </w:r>
           </w:p>
           <w:p>
@@ -33155,7 +33155,7 @@
                 <w:b/>
                 <w:sz w:val="16"/>
               </w:rPr>
-              <w:t>35</w:t>
+              <w:t>34</w:t>
             </w:r>
           </w:p>
           <w:p>

</xml_diff>